<commit_message>
JavaScript functions can return ElementReference to .NET
</commit_message>
<xml_diff>
--- a/Evidence/JavaScript Functions Can Return ElementReference to .NET.docx
+++ b/Evidence/JavaScript Functions Can Return ElementReference to .NET.docx
@@ -2,6 +2,10 @@
 <file path=word/document.xml><?xml version="1.0" encoding="utf-8"?>
 <w:document xmlns:wpc="http://schemas.microsoft.com/office/word/2010/wordprocessingCanvas" xmlns:cx="http://schemas.microsoft.com/office/drawing/2014/chartex" xmlns:cx1="http://schemas.microsoft.com/office/drawing/2015/9/8/chartex" xmlns:cx2="http://schemas.microsoft.com/office/drawing/2015/10/21/chartex" xmlns:cx3="http://schemas.microsoft.com/office/drawing/2016/5/9/chartex" xmlns:cx4="http://schemas.microsoft.com/office/drawing/2016/5/10/chartex" xmlns:cx5="http://schemas.microsoft.com/office/drawing/2016/5/11/chartex" xmlns:cx6="http://schemas.microsoft.com/office/drawing/2016/5/12/chartex" xmlns:cx7="http://schemas.microsoft.com/office/drawing/2016/5/13/chartex" xmlns:cx8="http://schemas.microsoft.com/office/drawing/2016/5/14/chartex" xmlns:mc="http://schemas.openxmlformats.org/markup-compatibility/2006" xmlns:aink="http://schemas.microsoft.com/office/drawing/2016/ink" xmlns:am3d="http://schemas.microsoft.com/office/drawing/2017/model3d" xmlns:o="urn:schemas-microsoft-com:office:office" xmlns:oel="http://schemas.microsoft.com/office/2019/extlst" xmlns:r="http://schemas.openxmlformats.org/officeDocument/2006/relationships" xmlns:m="http://schemas.openxmlformats.org/officeDocument/2006/math" xmlns:v="urn:schemas-microsoft-com:vml" xmlns:wp14="http://schemas.microsoft.com/office/word/2010/wordprocessingDrawing" xmlns:wp="http://schemas.openxmlformats.org/drawingml/2006/wordprocessingDrawing" xmlns:w10="urn:schemas-microsoft-com:office:word" xmlns:w="http://schemas.openxmlformats.org/wordprocessingml/2006/main" xmlns:w14="http://schemas.microsoft.com/office/word/2010/wordml" xmlns:w15="http://schemas.microsoft.com/office/word/2012/wordml" xmlns:w16cex="http://schemas.microsoft.com/office/word/2018/wordml/cex" xmlns:w16cid="http://schemas.microsoft.com/office/word/2016/wordml/cid" xmlns:w16="http://schemas.microsoft.com/office/word/2018/wordml" xmlns:w16du="http://schemas.microsoft.com/office/word/2023/wordml/word16du" xmlns:w16sdtdh="http://schemas.microsoft.com/office/word/2020/wordml/sdtdatahash" xmlns:w16sdtfl="http://schemas.microsoft.com/office/word/2024/wordml/sdtformatlock" xmlns:w16se="http://schemas.microsoft.com/office/word/2015/wordml/symex" xmlns:wpg="http://schemas.microsoft.com/office/word/2010/wordprocessingGroup" xmlns:wpi="http://schemas.microsoft.com/office/word/2010/wordprocessingInk" xmlns:wne="http://schemas.microsoft.com/office/word/2006/wordml" xmlns:wps="http://schemas.microsoft.com/office/word/2010/wordprocessingShape" mc:Ignorable="w14 w15 w16se w16cid w16 w16cex w16sdtdh w16sdtfl w16du wp14">
   <w:body>
+    <w:p/>
+    <w:p/>
+    <w:p/>
+    <w:p/>
     <w:tbl>
       <w:tblPr>
         <w:tblStyle w:val="TableGrid"/>
@@ -224,6 +228,15 @@
                 <w:bCs/>
               </w:rPr>
             </w:pPr>
+            <w:proofErr w:type="spellStart"/>
+            <w:r>
+              <w:rPr>
+                <w:b/>
+                <w:bCs/>
+              </w:rPr>
+              <w:t>InteractiveWebAssembly</w:t>
+            </w:r>
+            <w:proofErr w:type="spellEnd"/>
           </w:p>
         </w:tc>
         <w:tc>
@@ -290,6 +303,15 @@
                 <w:bCs/>
               </w:rPr>
             </w:pPr>
+            <w:proofErr w:type="spellStart"/>
+            <w:r>
+              <w:rPr>
+                <w:b/>
+                <w:bCs/>
+              </w:rPr>
+              <w:t>StandaloneWebAssembly</w:t>
+            </w:r>
+            <w:proofErr w:type="spellEnd"/>
           </w:p>
         </w:tc>
         <w:tc>
@@ -303,6 +325,13 @@
                 <w:bCs/>
               </w:rPr>
             </w:pPr>
+            <w:r>
+              <w:rPr>
+                <w:b/>
+                <w:bCs/>
+              </w:rPr>
+              <w:t>Pass</w:t>
+            </w:r>
           </w:p>
         </w:tc>
         <w:tc>
@@ -491,6 +520,15 @@
                 <w:bCs/>
               </w:rPr>
             </w:pPr>
+            <w:proofErr w:type="spellStart"/>
+            <w:r>
+              <w:rPr>
+                <w:b/>
+                <w:bCs/>
+              </w:rPr>
+              <w:t>InteractiveWebAssembly</w:t>
+            </w:r>
+            <w:proofErr w:type="spellEnd"/>
           </w:p>
           <w:p>
             <w:pPr>
@@ -512,6 +550,13 @@
                 <w:bCs/>
               </w:rPr>
             </w:pPr>
+            <w:r>
+              <w:rPr>
+                <w:b/>
+                <w:bCs/>
+              </w:rPr>
+              <w:t>Pass</w:t>
+            </w:r>
           </w:p>
         </w:tc>
         <w:tc>
@@ -525,6 +570,29 @@
                 <w:bCs/>
               </w:rPr>
             </w:pPr>
+            <w:r>
+              <w:rPr>
+                <w:b/>
+                <w:bCs/>
+              </w:rPr>
+              <w:t xml:space="preserve">Style Application </w:t>
+            </w:r>
+            <w:proofErr w:type="gramStart"/>
+            <w:r>
+              <w:rPr>
+                <w:b/>
+                <w:bCs/>
+              </w:rPr>
+              <w:t>on</w:t>
+            </w:r>
+            <w:proofErr w:type="gramEnd"/>
+            <w:r>
+              <w:rPr>
+                <w:b/>
+                <w:bCs/>
+              </w:rPr>
+              <w:t xml:space="preserve"> Dynamically Selected Input</w:t>
+            </w:r>
           </w:p>
         </w:tc>
       </w:tr>
@@ -573,6 +641,15 @@
                 <w:bCs/>
               </w:rPr>
             </w:pPr>
+            <w:proofErr w:type="spellStart"/>
+            <w:r>
+              <w:rPr>
+                <w:b/>
+                <w:bCs/>
+              </w:rPr>
+              <w:t>StandaloneWebAssembly</w:t>
+            </w:r>
+            <w:proofErr w:type="spellEnd"/>
           </w:p>
         </w:tc>
         <w:tc>
@@ -586,6 +663,13 @@
                 <w:bCs/>
               </w:rPr>
             </w:pPr>
+            <w:r>
+              <w:rPr>
+                <w:b/>
+                <w:bCs/>
+              </w:rPr>
+              <w:t>Pass</w:t>
+            </w:r>
           </w:p>
         </w:tc>
         <w:tc>
@@ -599,6 +683,29 @@
                 <w:bCs/>
               </w:rPr>
             </w:pPr>
+            <w:r>
+              <w:rPr>
+                <w:b/>
+                <w:bCs/>
+              </w:rPr>
+              <w:t xml:space="preserve">Style Application </w:t>
+            </w:r>
+            <w:proofErr w:type="gramStart"/>
+            <w:r>
+              <w:rPr>
+                <w:b/>
+                <w:bCs/>
+              </w:rPr>
+              <w:t>on</w:t>
+            </w:r>
+            <w:proofErr w:type="gramEnd"/>
+            <w:r>
+              <w:rPr>
+                <w:b/>
+                <w:bCs/>
+              </w:rPr>
+              <w:t xml:space="preserve"> Dynamically Selected Input</w:t>
+            </w:r>
           </w:p>
         </w:tc>
       </w:tr>
@@ -659,6 +766,7 @@
                 <w:b/>
                 <w:bCs/>
               </w:rPr>
+              <w:lastRenderedPageBreak/>
               <w:t>Interactive Server</w:t>
             </w:r>
           </w:p>
@@ -733,6 +841,15 @@
                 <w:bCs/>
               </w:rPr>
             </w:pPr>
+            <w:proofErr w:type="spellStart"/>
+            <w:r>
+              <w:rPr>
+                <w:b/>
+                <w:bCs/>
+              </w:rPr>
+              <w:t>InteractiveWebAssembly</w:t>
+            </w:r>
+            <w:proofErr w:type="spellEnd"/>
           </w:p>
         </w:tc>
         <w:tc>
@@ -746,6 +863,13 @@
                 <w:bCs/>
               </w:rPr>
             </w:pPr>
+            <w:r>
+              <w:rPr>
+                <w:b/>
+                <w:bCs/>
+              </w:rPr>
+              <w:t>Pass</w:t>
+            </w:r>
           </w:p>
         </w:tc>
         <w:tc>
@@ -759,6 +883,13 @@
                 <w:bCs/>
               </w:rPr>
             </w:pPr>
+            <w:r>
+              <w:rPr>
+                <w:b/>
+                <w:bCs/>
+              </w:rPr>
+              <w:t>Captured Input Return Fails on .NET 10</w:t>
+            </w:r>
           </w:p>
         </w:tc>
       </w:tr>
@@ -791,6 +922,15 @@
                 <w:bCs/>
               </w:rPr>
             </w:pPr>
+            <w:proofErr w:type="spellStart"/>
+            <w:r>
+              <w:rPr>
+                <w:b/>
+                <w:bCs/>
+              </w:rPr>
+              <w:t>StandaloneWebAssembly</w:t>
+            </w:r>
+            <w:proofErr w:type="spellEnd"/>
           </w:p>
         </w:tc>
         <w:tc>
@@ -804,6 +944,13 @@
                 <w:bCs/>
               </w:rPr>
             </w:pPr>
+            <w:r>
+              <w:rPr>
+                <w:b/>
+                <w:bCs/>
+              </w:rPr>
+              <w:t>Pass</w:t>
+            </w:r>
           </w:p>
         </w:tc>
         <w:tc>
@@ -817,6 +964,13 @@
                 <w:bCs/>
               </w:rPr>
             </w:pPr>
+            <w:r>
+              <w:rPr>
+                <w:b/>
+                <w:bCs/>
+              </w:rPr>
+              <w:t>Captured Input Return Fails on .NET 10</w:t>
+            </w:r>
           </w:p>
         </w:tc>
       </w:tr>
@@ -842,11 +996,7 @@
           </w:tcPr>
           <w:p>
             <w:r>
-              <w:t xml:space="preserve">Start with the .NET 10 app and capture the deserialization failure, then upgrade to .NET 11 and repeat with </w:t>
-            </w:r>
-            <w:r>
-              <w:lastRenderedPageBreak/>
-              <w:t>the same component and module.</w:t>
+              <w:t>Start with the .NET 10 app and capture the deserialization failure, then upgrade to .NET 11 and repeat with the same component and module.</w:t>
             </w:r>
           </w:p>
         </w:tc>
@@ -866,7 +1016,6 @@
                 <w:b/>
                 <w:bCs/>
               </w:rPr>
-              <w:lastRenderedPageBreak/>
               <w:t>Interactive Server</w:t>
             </w:r>
           </w:p>
@@ -1120,7 +1269,6 @@
                       <w:b/>
                       <w:bCs/>
                     </w:rPr>
-                    <w:lastRenderedPageBreak/>
                     <w:t>.NET 11</w:t>
                   </w:r>
                 </w:p>
@@ -1217,6 +1365,15 @@
                 <w:bCs/>
               </w:rPr>
             </w:pPr>
+            <w:proofErr w:type="spellStart"/>
+            <w:r>
+              <w:rPr>
+                <w:b/>
+                <w:bCs/>
+              </w:rPr>
+              <w:t>InteractiveWebAssembly</w:t>
+            </w:r>
+            <w:proofErr w:type="spellEnd"/>
           </w:p>
         </w:tc>
         <w:tc>
@@ -1230,12 +1387,293 @@
                 <w:bCs/>
               </w:rPr>
             </w:pPr>
+            <w:r>
+              <w:rPr>
+                <w:b/>
+                <w:bCs/>
+              </w:rPr>
+              <w:t>Pass</w:t>
+            </w:r>
           </w:p>
         </w:tc>
         <w:tc>
           <w:tcPr>
             <w:tcW w:w="3330" w:type="dxa"/>
           </w:tcPr>
+          <w:p>
+            <w:pPr>
+              <w:rPr>
+                <w:b/>
+                <w:bCs/>
+              </w:rPr>
+            </w:pPr>
+          </w:p>
+          <w:tbl>
+            <w:tblPr>
+              <w:tblW w:w="2988" w:type="dxa"/>
+              <w:tblCellSpacing w:w="15" w:type="dxa"/>
+              <w:tblBorders>
+                <w:top w:val="single" w:sz="4" w:space="0" w:color="auto"/>
+                <w:left w:val="single" w:sz="4" w:space="0" w:color="auto"/>
+                <w:bottom w:val="single" w:sz="4" w:space="0" w:color="auto"/>
+                <w:right w:val="single" w:sz="4" w:space="0" w:color="auto"/>
+              </w:tblBorders>
+              <w:tblCellMar>
+                <w:top w:w="15" w:type="dxa"/>
+                <w:left w:w="15" w:type="dxa"/>
+                <w:bottom w:w="15" w:type="dxa"/>
+                <w:right w:w="15" w:type="dxa"/>
+              </w:tblCellMar>
+              <w:tblLook w:val="04A0" w:firstRow="1" w:lastRow="0" w:firstColumn="1" w:lastColumn="0" w:noHBand="0" w:noVBand="1"/>
+            </w:tblPr>
+            <w:tblGrid>
+              <w:gridCol w:w="1285"/>
+              <w:gridCol w:w="1703"/>
+            </w:tblGrid>
+            <w:tr>
+              <w:trPr>
+                <w:trHeight w:val="110"/>
+                <w:tblHeader/>
+                <w:tblCellSpacing w:w="15" w:type="dxa"/>
+              </w:trPr>
+              <w:tc>
+                <w:tcPr>
+                  <w:tcW w:w="1240" w:type="dxa"/>
+                  <w:tcBorders>
+                    <w:top w:val="nil"/>
+                    <w:left w:val="nil"/>
+                    <w:bottom w:val="single" w:sz="4" w:space="0" w:color="auto"/>
+                    <w:right w:val="single" w:sz="4" w:space="0" w:color="auto"/>
+                  </w:tcBorders>
+                  <w:tcMar>
+                    <w:top w:w="60" w:type="dxa"/>
+                    <w:left w:w="90" w:type="dxa"/>
+                    <w:bottom w:w="60" w:type="dxa"/>
+                    <w:right w:w="90" w:type="dxa"/>
+                  </w:tcMar>
+                  <w:vAlign w:val="center"/>
+                  <w:hideMark/>
+                </w:tcPr>
+                <w:p>
+                  <w:pPr>
+                    <w:spacing w:after="0" w:line="240" w:lineRule="auto"/>
+                    <w:rPr>
+                      <w:b/>
+                      <w:bCs/>
+                    </w:rPr>
+                  </w:pPr>
+                  <w:r>
+                    <w:rPr>
+                      <w:b/>
+                      <w:bCs/>
+                    </w:rPr>
+                    <w:t>Version</w:t>
+                  </w:r>
+                </w:p>
+              </w:tc>
+              <w:tc>
+                <w:tcPr>
+                  <w:tcW w:w="1658" w:type="dxa"/>
+                  <w:tcBorders>
+                    <w:top w:val="nil"/>
+                    <w:left w:val="nil"/>
+                    <w:bottom w:val="single" w:sz="4" w:space="0" w:color="auto"/>
+                    <w:right w:val="nil"/>
+                  </w:tcBorders>
+                  <w:tcMar>
+                    <w:top w:w="60" w:type="dxa"/>
+                    <w:left w:w="90" w:type="dxa"/>
+                    <w:bottom w:w="60" w:type="dxa"/>
+                    <w:right w:w="90" w:type="dxa"/>
+                  </w:tcMar>
+                  <w:vAlign w:val="center"/>
+                  <w:hideMark/>
+                </w:tcPr>
+                <w:p>
+                  <w:pPr>
+                    <w:spacing w:after="0" w:line="240" w:lineRule="auto"/>
+                    <w:rPr>
+                      <w:b/>
+                      <w:bCs/>
+                    </w:rPr>
+                  </w:pPr>
+                  <w:r>
+                    <w:rPr>
+                      <w:b/>
+                      <w:bCs/>
+                    </w:rPr>
+                    <w:t>Result</w:t>
+                  </w:r>
+                </w:p>
+              </w:tc>
+            </w:tr>
+            <w:tr>
+              <w:trPr>
+                <w:trHeight w:val="110"/>
+                <w:tblCellSpacing w:w="15" w:type="dxa"/>
+              </w:trPr>
+              <w:tc>
+                <w:tcPr>
+                  <w:tcW w:w="1240" w:type="dxa"/>
+                  <w:tcBorders>
+                    <w:top w:val="nil"/>
+                    <w:left w:val="nil"/>
+                    <w:bottom w:val="single" w:sz="4" w:space="0" w:color="auto"/>
+                    <w:right w:val="single" w:sz="4" w:space="0" w:color="auto"/>
+                  </w:tcBorders>
+                  <w:tcMar>
+                    <w:top w:w="60" w:type="dxa"/>
+                    <w:left w:w="90" w:type="dxa"/>
+                    <w:bottom w:w="60" w:type="dxa"/>
+                    <w:right w:w="90" w:type="dxa"/>
+                  </w:tcMar>
+                  <w:vAlign w:val="center"/>
+                  <w:hideMark/>
+                </w:tcPr>
+                <w:p>
+                  <w:pPr>
+                    <w:spacing w:after="0" w:line="240" w:lineRule="auto"/>
+                    <w:rPr>
+                      <w:b/>
+                      <w:bCs/>
+                    </w:rPr>
+                  </w:pPr>
+                  <w:r>
+                    <w:rPr>
+                      <w:b/>
+                      <w:bCs/>
+                    </w:rPr>
+                    <w:t>.NET 10</w:t>
+                  </w:r>
+                </w:p>
+              </w:tc>
+              <w:tc>
+                <w:tcPr>
+                  <w:tcW w:w="1658" w:type="dxa"/>
+                  <w:tcBorders>
+                    <w:top w:val="nil"/>
+                    <w:left w:val="nil"/>
+                    <w:bottom w:val="single" w:sz="4" w:space="0" w:color="auto"/>
+                    <w:right w:val="nil"/>
+                  </w:tcBorders>
+                  <w:tcMar>
+                    <w:top w:w="60" w:type="dxa"/>
+                    <w:left w:w="90" w:type="dxa"/>
+                    <w:bottom w:w="60" w:type="dxa"/>
+                    <w:right w:w="90" w:type="dxa"/>
+                  </w:tcMar>
+                  <w:vAlign w:val="center"/>
+                </w:tcPr>
+                <w:p>
+                  <w:pPr>
+                    <w:spacing w:after="0" w:line="240" w:lineRule="auto"/>
+                    <w:rPr>
+                      <w:b/>
+                      <w:bCs/>
+                    </w:rPr>
+                  </w:pPr>
+                  <w:r>
+                    <w:rPr>
+                      <w:b/>
+                      <w:bCs/>
+                    </w:rPr>
+                    <w:t>.NET 10 - Captured Input Return Failure</w:t>
+                  </w:r>
+                  <w:r>
+                    <w:rPr>
+                      <w:b/>
+                      <w:bCs/>
+                    </w:rPr>
+                    <w:t xml:space="preserve"> </w:t>
+                  </w:r>
+                </w:p>
+              </w:tc>
+            </w:tr>
+            <w:tr>
+              <w:trPr>
+                <w:trHeight w:val="104"/>
+                <w:tblCellSpacing w:w="15" w:type="dxa"/>
+              </w:trPr>
+              <w:tc>
+                <w:tcPr>
+                  <w:tcW w:w="1240" w:type="dxa"/>
+                  <w:tcBorders>
+                    <w:top w:val="nil"/>
+                    <w:left w:val="nil"/>
+                    <w:bottom w:val="nil"/>
+                    <w:right w:val="single" w:sz="4" w:space="0" w:color="auto"/>
+                  </w:tcBorders>
+                  <w:tcMar>
+                    <w:top w:w="60" w:type="dxa"/>
+                    <w:left w:w="90" w:type="dxa"/>
+                    <w:bottom w:w="60" w:type="dxa"/>
+                    <w:right w:w="90" w:type="dxa"/>
+                  </w:tcMar>
+                  <w:vAlign w:val="center"/>
+                  <w:hideMark/>
+                </w:tcPr>
+                <w:p>
+                  <w:pPr>
+                    <w:spacing w:after="0" w:line="240" w:lineRule="auto"/>
+                    <w:rPr>
+                      <w:b/>
+                      <w:bCs/>
+                    </w:rPr>
+                  </w:pPr>
+                  <w:r>
+                    <w:rPr>
+                      <w:b/>
+                      <w:bCs/>
+                    </w:rPr>
+                    <w:t>.NET 11</w:t>
+                  </w:r>
+                </w:p>
+              </w:tc>
+              <w:tc>
+                <w:tcPr>
+                  <w:tcW w:w="1658" w:type="dxa"/>
+                  <w:tcBorders>
+                    <w:top w:val="nil"/>
+                    <w:left w:val="nil"/>
+                    <w:bottom w:val="nil"/>
+                    <w:right w:val="nil"/>
+                  </w:tcBorders>
+                  <w:tcMar>
+                    <w:top w:w="60" w:type="dxa"/>
+                    <w:left w:w="90" w:type="dxa"/>
+                    <w:bottom w:w="60" w:type="dxa"/>
+                    <w:right w:w="90" w:type="dxa"/>
+                  </w:tcMar>
+                  <w:vAlign w:val="center"/>
+                </w:tcPr>
+                <w:p>
+                  <w:pPr>
+                    <w:spacing w:after="0" w:line="240" w:lineRule="auto"/>
+                    <w:rPr>
+                      <w:b/>
+                      <w:bCs/>
+                    </w:rPr>
+                  </w:pPr>
+                  <w:r>
+                    <w:rPr>
+                      <w:b/>
+                      <w:bCs/>
+                    </w:rPr>
+                    <w:t>.NET 11 - Captured Input Return Success</w:t>
+                  </w:r>
+                </w:p>
+                <w:p>
+                  <w:pPr>
+                    <w:spacing w:after="0" w:line="240" w:lineRule="auto"/>
+                    <w:rPr>
+                      <w:b/>
+                      <w:bCs/>
+                    </w:rPr>
+                  </w:pPr>
+                </w:p>
+              </w:tc>
+            </w:tr>
+          </w:tbl>
           <w:p>
             <w:pPr>
               <w:rPr>
@@ -1275,6 +1713,15 @@
                 <w:bCs/>
               </w:rPr>
             </w:pPr>
+            <w:proofErr w:type="spellStart"/>
+            <w:r>
+              <w:rPr>
+                <w:b/>
+                <w:bCs/>
+              </w:rPr>
+              <w:t>StandaloneWebAssembly</w:t>
+            </w:r>
+            <w:proofErr w:type="spellEnd"/>
           </w:p>
         </w:tc>
         <w:tc>
@@ -1288,12 +1735,309 @@
                 <w:bCs/>
               </w:rPr>
             </w:pPr>
+            <w:r>
+              <w:rPr>
+                <w:b/>
+                <w:bCs/>
+              </w:rPr>
+              <w:t>Pass</w:t>
+            </w:r>
           </w:p>
         </w:tc>
         <w:tc>
           <w:tcPr>
             <w:tcW w:w="3330" w:type="dxa"/>
           </w:tcPr>
+          <w:p>
+            <w:pPr>
+              <w:rPr>
+                <w:b/>
+                <w:bCs/>
+              </w:rPr>
+            </w:pPr>
+          </w:p>
+          <w:tbl>
+            <w:tblPr>
+              <w:tblW w:w="3109" w:type="dxa"/>
+              <w:tblCellSpacing w:w="15" w:type="dxa"/>
+              <w:tblBorders>
+                <w:top w:val="single" w:sz="4" w:space="0" w:color="auto"/>
+                <w:left w:val="single" w:sz="4" w:space="0" w:color="auto"/>
+                <w:bottom w:val="single" w:sz="4" w:space="0" w:color="auto"/>
+                <w:right w:val="single" w:sz="4" w:space="0" w:color="auto"/>
+              </w:tblBorders>
+              <w:tblCellMar>
+                <w:top w:w="15" w:type="dxa"/>
+                <w:left w:w="15" w:type="dxa"/>
+                <w:bottom w:w="15" w:type="dxa"/>
+                <w:right w:w="15" w:type="dxa"/>
+              </w:tblCellMar>
+              <w:tblLook w:val="04A0" w:firstRow="1" w:lastRow="0" w:firstColumn="1" w:lastColumn="0" w:noHBand="0" w:noVBand="1"/>
+            </w:tblPr>
+            <w:tblGrid>
+              <w:gridCol w:w="1337"/>
+              <w:gridCol w:w="1772"/>
+            </w:tblGrid>
+            <w:tr>
+              <w:trPr>
+                <w:trHeight w:val="128"/>
+                <w:tblHeader/>
+                <w:tblCellSpacing w:w="15" w:type="dxa"/>
+              </w:trPr>
+              <w:tc>
+                <w:tcPr>
+                  <w:tcW w:w="1292" w:type="dxa"/>
+                  <w:tcBorders>
+                    <w:top w:val="nil"/>
+                    <w:left w:val="nil"/>
+                    <w:bottom w:val="single" w:sz="4" w:space="0" w:color="auto"/>
+                    <w:right w:val="single" w:sz="4" w:space="0" w:color="auto"/>
+                  </w:tcBorders>
+                  <w:tcMar>
+                    <w:top w:w="60" w:type="dxa"/>
+                    <w:left w:w="90" w:type="dxa"/>
+                    <w:bottom w:w="60" w:type="dxa"/>
+                    <w:right w:w="90" w:type="dxa"/>
+                  </w:tcMar>
+                  <w:vAlign w:val="center"/>
+                  <w:hideMark/>
+                </w:tcPr>
+                <w:p>
+                  <w:pPr>
+                    <w:spacing w:after="0" w:line="240" w:lineRule="auto"/>
+                    <w:rPr>
+                      <w:b/>
+                      <w:bCs/>
+                    </w:rPr>
+                  </w:pPr>
+                  <w:r>
+                    <w:rPr>
+                      <w:b/>
+                      <w:bCs/>
+                    </w:rPr>
+                    <w:t>Version</w:t>
+                  </w:r>
+                </w:p>
+              </w:tc>
+              <w:tc>
+                <w:tcPr>
+                  <w:tcW w:w="1727" w:type="dxa"/>
+                  <w:tcBorders>
+                    <w:top w:val="nil"/>
+                    <w:left w:val="nil"/>
+                    <w:bottom w:val="single" w:sz="4" w:space="0" w:color="auto"/>
+                    <w:right w:val="nil"/>
+                  </w:tcBorders>
+                  <w:tcMar>
+                    <w:top w:w="60" w:type="dxa"/>
+                    <w:left w:w="90" w:type="dxa"/>
+                    <w:bottom w:w="60" w:type="dxa"/>
+                    <w:right w:w="90" w:type="dxa"/>
+                  </w:tcMar>
+                  <w:vAlign w:val="center"/>
+                  <w:hideMark/>
+                </w:tcPr>
+                <w:p>
+                  <w:pPr>
+                    <w:spacing w:after="0" w:line="240" w:lineRule="auto"/>
+                    <w:rPr>
+                      <w:b/>
+                      <w:bCs/>
+                    </w:rPr>
+                  </w:pPr>
+                  <w:r>
+                    <w:rPr>
+                      <w:b/>
+                      <w:bCs/>
+                    </w:rPr>
+                    <w:t>Result</w:t>
+                  </w:r>
+                </w:p>
+              </w:tc>
+            </w:tr>
+            <w:tr>
+              <w:trPr>
+                <w:trHeight w:val="128"/>
+                <w:tblCellSpacing w:w="15" w:type="dxa"/>
+              </w:trPr>
+              <w:tc>
+                <w:tcPr>
+                  <w:tcW w:w="1292" w:type="dxa"/>
+                  <w:tcBorders>
+                    <w:top w:val="nil"/>
+                    <w:left w:val="nil"/>
+                    <w:bottom w:val="single" w:sz="4" w:space="0" w:color="auto"/>
+                    <w:right w:val="single" w:sz="4" w:space="0" w:color="auto"/>
+                  </w:tcBorders>
+                  <w:tcMar>
+                    <w:top w:w="60" w:type="dxa"/>
+                    <w:left w:w="90" w:type="dxa"/>
+                    <w:bottom w:w="60" w:type="dxa"/>
+                    <w:right w:w="90" w:type="dxa"/>
+                  </w:tcMar>
+                  <w:vAlign w:val="center"/>
+                  <w:hideMark/>
+                </w:tcPr>
+                <w:p>
+                  <w:pPr>
+                    <w:spacing w:after="0" w:line="240" w:lineRule="auto"/>
+                    <w:rPr>
+                      <w:b/>
+                      <w:bCs/>
+                    </w:rPr>
+                  </w:pPr>
+                  <w:r>
+                    <w:rPr>
+                      <w:b/>
+                      <w:bCs/>
+                    </w:rPr>
+                    <w:t>.NET 10</w:t>
+                  </w:r>
+                </w:p>
+              </w:tc>
+              <w:tc>
+                <w:tcPr>
+                  <w:tcW w:w="1727" w:type="dxa"/>
+                  <w:tcBorders>
+                    <w:top w:val="nil"/>
+                    <w:left w:val="nil"/>
+                    <w:bottom w:val="single" w:sz="4" w:space="0" w:color="auto"/>
+                    <w:right w:val="nil"/>
+                  </w:tcBorders>
+                  <w:tcMar>
+                    <w:top w:w="60" w:type="dxa"/>
+                    <w:left w:w="90" w:type="dxa"/>
+                    <w:bottom w:w="60" w:type="dxa"/>
+                    <w:right w:w="90" w:type="dxa"/>
+                  </w:tcMar>
+                  <w:vAlign w:val="center"/>
+                </w:tcPr>
+                <w:p>
+                  <w:pPr>
+                    <w:spacing w:after="0" w:line="240" w:lineRule="auto"/>
+                    <w:rPr>
+                      <w:b/>
+                      <w:bCs/>
+                    </w:rPr>
+                  </w:pPr>
+                  <w:r>
+                    <w:rPr>
+                      <w:b/>
+                      <w:bCs/>
+                    </w:rPr>
+                    <w:t>.NET 10 - Captured Input Return Failure</w:t>
+                  </w:r>
+                  <w:r>
+                    <w:rPr>
+                      <w:b/>
+                      <w:bCs/>
+                    </w:rPr>
+                    <w:t xml:space="preserve"> </w:t>
+                  </w:r>
+                </w:p>
+              </w:tc>
+            </w:tr>
+            <w:tr>
+              <w:trPr>
+                <w:trHeight w:val="121"/>
+                <w:tblCellSpacing w:w="15" w:type="dxa"/>
+              </w:trPr>
+              <w:tc>
+                <w:tcPr>
+                  <w:tcW w:w="1292" w:type="dxa"/>
+                  <w:tcBorders>
+                    <w:top w:val="nil"/>
+                    <w:left w:val="nil"/>
+                    <w:bottom w:val="nil"/>
+                    <w:right w:val="single" w:sz="4" w:space="0" w:color="auto"/>
+                  </w:tcBorders>
+                  <w:tcMar>
+                    <w:top w:w="60" w:type="dxa"/>
+                    <w:left w:w="90" w:type="dxa"/>
+                    <w:bottom w:w="60" w:type="dxa"/>
+                    <w:right w:w="90" w:type="dxa"/>
+                  </w:tcMar>
+                  <w:vAlign w:val="center"/>
+                  <w:hideMark/>
+                </w:tcPr>
+                <w:p>
+                  <w:pPr>
+                    <w:spacing w:after="0" w:line="240" w:lineRule="auto"/>
+                    <w:rPr>
+                      <w:b/>
+                      <w:bCs/>
+                    </w:rPr>
+                  </w:pPr>
+                  <w:r>
+                    <w:rPr>
+                      <w:b/>
+                      <w:bCs/>
+                    </w:rPr>
+                    <w:t>.NET 11</w:t>
+                  </w:r>
+                </w:p>
+              </w:tc>
+              <w:tc>
+                <w:tcPr>
+                  <w:tcW w:w="1727" w:type="dxa"/>
+                  <w:tcBorders>
+                    <w:top w:val="nil"/>
+                    <w:left w:val="nil"/>
+                    <w:bottom w:val="nil"/>
+                    <w:right w:val="nil"/>
+                  </w:tcBorders>
+                  <w:tcMar>
+                    <w:top w:w="60" w:type="dxa"/>
+                    <w:left w:w="90" w:type="dxa"/>
+                    <w:bottom w:w="60" w:type="dxa"/>
+                    <w:right w:w="90" w:type="dxa"/>
+                  </w:tcMar>
+                  <w:vAlign w:val="center"/>
+                </w:tcPr>
+                <w:p>
+                  <w:pPr>
+                    <w:spacing w:after="0" w:line="240" w:lineRule="auto"/>
+                    <w:rPr>
+                      <w:b/>
+                      <w:bCs/>
+                    </w:rPr>
+                  </w:pPr>
+                  <w:r>
+                    <w:rPr>
+                      <w:b/>
+                      <w:bCs/>
+                    </w:rPr>
+                    <w:t xml:space="preserve">.NET 11 - Captured </w:t>
+                  </w:r>
+                  <w:r>
+                    <w:rPr>
+                      <w:b/>
+                      <w:bCs/>
+                    </w:rPr>
+                    <w:lastRenderedPageBreak/>
+                    <w:t>Input Return Success</w:t>
+                  </w:r>
+                </w:p>
+                <w:p>
+                  <w:pPr>
+                    <w:spacing w:after="0" w:line="240" w:lineRule="auto"/>
+                    <w:rPr>
+                      <w:b/>
+                      <w:bCs/>
+                    </w:rPr>
+                  </w:pPr>
+                </w:p>
+              </w:tc>
+            </w:tr>
+          </w:tbl>
+          <w:p>
+            <w:pPr>
+              <w:rPr>
+                <w:b/>
+                <w:bCs/>
+              </w:rPr>
+            </w:pPr>
+          </w:p>
           <w:p>
             <w:pPr>
               <w:rPr>
@@ -1315,6 +2059,7 @@
           </w:tcPr>
           <w:p>
             <w:r>
+              <w:lastRenderedPageBreak/>
               <w:t>5</w:t>
             </w:r>
           </w:p>
@@ -1485,6 +2230,15 @@
                 <w:bCs/>
               </w:rPr>
             </w:pPr>
+            <w:proofErr w:type="spellStart"/>
+            <w:r>
+              <w:rPr>
+                <w:b/>
+                <w:bCs/>
+              </w:rPr>
+              <w:t>InteractiveWebAssembly</w:t>
+            </w:r>
+            <w:proofErr w:type="spellEnd"/>
           </w:p>
         </w:tc>
         <w:tc>
@@ -1498,6 +2252,13 @@
                 <w:bCs/>
               </w:rPr>
             </w:pPr>
+            <w:r>
+              <w:rPr>
+                <w:b/>
+                <w:bCs/>
+              </w:rPr>
+              <w:t>Pass</w:t>
+            </w:r>
           </w:p>
         </w:tc>
         <w:tc>
@@ -1511,6 +2272,29 @@
                 <w:bCs/>
               </w:rPr>
             </w:pPr>
+            <w:r>
+              <w:rPr>
+                <w:b/>
+                <w:bCs/>
+              </w:rPr>
+              <w:t>Input Without @ref Returns __</w:t>
+            </w:r>
+            <w:proofErr w:type="spellStart"/>
+            <w:r>
+              <w:rPr>
+                <w:b/>
+                <w:bCs/>
+              </w:rPr>
+              <w:t>internalId</w:t>
+            </w:r>
+            <w:proofErr w:type="spellEnd"/>
+            <w:r>
+              <w:rPr>
+                <w:b/>
+                <w:bCs/>
+              </w:rPr>
+              <w:t xml:space="preserve"> is required</w:t>
+            </w:r>
           </w:p>
         </w:tc>
       </w:tr>
@@ -1543,6 +2327,15 @@
                 <w:bCs/>
               </w:rPr>
             </w:pPr>
+            <w:proofErr w:type="spellStart"/>
+            <w:r>
+              <w:rPr>
+                <w:b/>
+                <w:bCs/>
+              </w:rPr>
+              <w:t>StandaloneWebAssembly</w:t>
+            </w:r>
+            <w:proofErr w:type="spellEnd"/>
           </w:p>
         </w:tc>
         <w:tc>
@@ -1556,6 +2349,13 @@
                 <w:bCs/>
               </w:rPr>
             </w:pPr>
+            <w:r>
+              <w:rPr>
+                <w:b/>
+                <w:bCs/>
+              </w:rPr>
+              <w:t>Pass</w:t>
+            </w:r>
           </w:p>
         </w:tc>
         <w:tc>
@@ -1569,10 +2369,34 @@
                 <w:bCs/>
               </w:rPr>
             </w:pPr>
+            <w:r>
+              <w:rPr>
+                <w:b/>
+                <w:bCs/>
+              </w:rPr>
+              <w:t>Input Without @ref Returns __</w:t>
+            </w:r>
+            <w:proofErr w:type="spellStart"/>
+            <w:r>
+              <w:rPr>
+                <w:b/>
+                <w:bCs/>
+              </w:rPr>
+              <w:t>internalId</w:t>
+            </w:r>
+            <w:proofErr w:type="spellEnd"/>
+            <w:r>
+              <w:rPr>
+                <w:b/>
+                <w:bCs/>
+              </w:rPr>
+              <w:t xml:space="preserve"> is required</w:t>
+            </w:r>
           </w:p>
         </w:tc>
       </w:tr>
     </w:tbl>
+    <w:p/>
     <w:p/>
     <w:sectPr>
       <w:pgSz w:w="12240" w:h="15840"/>
@@ -1984,7 +2808,7 @@
   <w:style w:type="paragraph" w:default="1" w:styleId="Normal">
     <w:name w:val="Normal"/>
     <w:qFormat/>
-    <w:rsid w:val="00296E03"/>
+    <w:rsid w:val="007A7613"/>
   </w:style>
   <w:style w:type="paragraph" w:styleId="Heading1">
     <w:name w:val="heading 1"/>

</xml_diff>